<commit_message>
CI-1: Coinbase resume v2 — complete, no placeholders, built from Josh's real resume data and format
</commit_message>
<xml_diff>
--- a/jobs/packets/active/coinbase-billing-ops/resume-coinbase.docx
+++ b/jobs/packets/active/coinbase-billing-ops/resume-coinbase.docx
@@ -4,7 +4,7 @@
   <w:body>
     <w:p>
       <w:pPr>
-        <w:spacing w:after="30"/>
+        <w:spacing w:after="20"/>
         <w:jc w:val="center"/>
       </w:pPr>
       <w:r>
@@ -12,15 +12,30 @@
           <w:rFonts w:ascii="Arial" w:cs="Arial" w:eastAsia="Arial" w:hAnsi="Arial"/>
           <w:b/>
           <w:bCs/>
-          <w:sz w:val="32"/>
-          <w:szCs w:val="32"/>
+          <w:sz w:val="30"/>
+          <w:szCs w:val="30"/>
         </w:rPr>
         <w:t xml:space="preserve">JOSH STOKESBERRY</w:t>
       </w:r>
     </w:p>
     <w:p>
       <w:pPr>
-        <w:spacing w:after="140"/>
+        <w:spacing w:after="20"/>
+        <w:jc w:val="center"/>
+      </w:pPr>
+      <w:r>
+        <w:rPr>
+          <w:rFonts w:ascii="Arial" w:cs="Arial" w:eastAsia="Arial" w:hAnsi="Arial"/>
+          <w:color w:val="333333"/>
+          <w:sz w:val="19"/>
+          <w:szCs w:val="19"/>
+        </w:rPr>
+        <w:t xml:space="preserve">Billing Operations &amp; Strategy | Financial Controls | Reconciliation | Crypto-Native Operations</w:t>
+      </w:r>
+    </w:p>
+    <w:p>
+      <w:pPr>
+        <w:spacing w:after="120"/>
         <w:jc w:val="center"/>
       </w:pPr>
       <w:r>
@@ -30,46 +45,28 @@
           <w:sz w:val="19"/>
           <w:szCs w:val="19"/>
         </w:rPr>
-        <w:t xml:space="preserve">Oklahoma City, OK · stokesberryjosh@gmail.com · [phone] · [LinkedIn URL]</w:t>
-      </w:r>
-    </w:p>
-    <w:p>
-      <w:pPr>
-        <w:spacing w:after="120"/>
-      </w:pPr>
-      <w:r>
-        <w:rPr>
-          <w:rFonts w:ascii="Arial" w:cs="Arial" w:eastAsia="Arial" w:hAnsi="Arial"/>
-          <w:sz w:val="21"/>
-          <w:szCs w:val="21"/>
-        </w:rPr>
-        <w:t xml:space="preserve">Financial operations analyst with 6+ years in institutional post-trade operations at S&amp;P Global — reconciliation, exception management, controls, and multi-party settlement coordination at $10B+ scale — plus published S&amp;P Global crypto research and years of hands-on DeFi use. Seeking to keep high-volume crypto billing operations boring, reliable, and continuously improving.</w:t>
+        <w:t xml:space="preserve">Oklahoma City, OK | Remote (US) | stokesberryjosh@gmail.com | 405-343-4072</w:t>
+      </w:r>
+    </w:p>
+    <w:p>
+      <w:pPr>
+        <w:spacing w:after="100"/>
+      </w:pPr>
+      <w:r>
+        <w:rPr>
+          <w:rFonts w:ascii="Arial" w:cs="Arial" w:eastAsia="Arial" w:hAnsi="Arial"/>
+          <w:sz w:val="20"/>
+          <w:szCs w:val="20"/>
+        </w:rPr>
+        <w:t xml:space="preserve">Financial operations professional with 6+ years at S&amp;P Global facilitating $10B+ in institutional trade workflows. Experienced in high-volume transaction tracking, reconciliation-minded exception resolution, escalation handling, daily operational reporting, and process improvement across complex multi-party financial workflows. Published S&amp;P Global crypto research contributor and hands-on DeFi user — a controls-oriented operator who understands both institutional billing discipline and the crypto-native systems Coinbase customers live in.</w:t>
       </w:r>
     </w:p>
     <w:p>
       <w:pPr>
         <w:pBdr>
-          <w:bottom w:val="single" w:color="444444" w:sz="4" w:space="2"/>
+          <w:bottom w:val="single" w:color="555555" w:sz="4" w:space="2"/>
         </w:pBdr>
-        <w:spacing w:after="90" w:before="200"/>
-      </w:pPr>
-      <w:r>
-        <w:rPr>
-          <w:rFonts w:ascii="Arial" w:cs="Arial" w:eastAsia="Arial" w:hAnsi="Arial"/>
-          <w:b/>
-          <w:bCs/>
-          <w:sz w:val="22"/>
-          <w:szCs w:val="22"/>
-        </w:rPr>
-        <w:t xml:space="preserve">EXPERIENCE</w:t>
-      </w:r>
-    </w:p>
-    <w:p>
-      <w:pPr>
-        <w:tabs>
-          <w:tab w:val="right" w:pos="9026"/>
-        </w:tabs>
-        <w:spacing w:after="40" w:before="110"/>
+        <w:spacing w:after="80" w:before="170"/>
       </w:pPr>
       <w:r>
         <w:rPr>
@@ -79,16 +76,301 @@
           <w:sz w:val="21"/>
           <w:szCs w:val="21"/>
         </w:rPr>
-        <w:t xml:space="preserve">S&amp;P Global — Financial Operations Analyst</w:t>
-      </w:r>
-      <w:r>
-        <w:rPr>
-          <w:rFonts w:ascii="Arial" w:cs="Arial" w:eastAsia="Arial" w:hAnsi="Arial"/>
-          <w:color w:val="555555"/>
+        <w:t xml:space="preserve">COINBASE ROLE ALIGNMENT</w:t>
+      </w:r>
+    </w:p>
+    <w:tbl>
+      <w:tblPr>
+        <w:tblW w:type="dxa" w:w="10080"/>
+        <w:tblBorders>
+          <w:top w:val="single" w:color="auto" w:sz="4"/>
+          <w:left w:val="single" w:color="auto" w:sz="4"/>
+          <w:bottom w:val="single" w:color="auto" w:sz="4"/>
+          <w:right w:val="single" w:color="auto" w:sz="4"/>
+          <w:insideH w:val="single" w:color="auto" w:sz="4"/>
+          <w:insideV w:val="single" w:color="auto" w:sz="4"/>
+        </w:tblBorders>
+      </w:tblPr>
+      <w:tblGrid>
+        <w:gridCol w:w="2500"/>
+        <w:gridCol w:w="7580"/>
+      </w:tblGrid>
+      <w:tr>
+        <w:tc>
+          <w:tcPr>
+            <w:tcW w:type="dxa" w:w="2500"/>
+            <w:tcBorders>
+              <w:top w:val="none"/>
+              <w:left w:val="none"/>
+              <w:bottom w:val="none"/>
+              <w:right w:val="none"/>
+            </w:tcBorders>
+            <w:tcMar>
+              <w:top w:type="dxa" w:w="30"/>
+              <w:left w:type="dxa" w:w="0"/>
+              <w:bottom w:type="dxa" w:w="30"/>
+              <w:right w:type="dxa" w:w="120"/>
+            </w:tcMar>
+          </w:tcPr>
+          <w:p>
+            <w:r>
+              <w:rPr>
+                <w:rFonts w:ascii="Arial" w:cs="Arial" w:eastAsia="Arial" w:hAnsi="Arial"/>
+                <w:b/>
+                <w:bCs/>
+                <w:sz w:val="20"/>
+                <w:szCs w:val="20"/>
+              </w:rPr>
+              <w:t xml:space="preserve">Billing &amp; Reconciliation Ops</w:t>
+            </w:r>
+          </w:p>
+        </w:tc>
+        <w:tc>
+          <w:tcPr>
+            <w:tcW w:type="dxa" w:w="7580"/>
+            <w:tcBorders>
+              <w:top w:val="none"/>
+              <w:left w:val="none"/>
+              <w:bottom w:val="none"/>
+              <w:right w:val="none"/>
+            </w:tcBorders>
+            <w:tcMar>
+              <w:top w:type="dxa" w:w="30"/>
+              <w:left w:type="dxa" w:w="0"/>
+              <w:bottom w:type="dxa" w:w="30"/>
+              <w:right w:type="dxa" w:w="0"/>
+            </w:tcMar>
+          </w:tcPr>
+          <w:p>
+            <w:r>
+              <w:rPr>
+                <w:rFonts w:ascii="Arial" w:cs="Arial" w:eastAsia="Arial" w:hAnsi="Arial"/>
+                <w:sz w:val="20"/>
+                <w:szCs w:val="20"/>
+              </w:rPr>
+              <w:t xml:space="preserve">High-volume transaction monitoring, exception triage, reconciliation mindset, documentation and funding accuracy, aging-item resolution, operational controls.</w:t>
+            </w:r>
+          </w:p>
+        </w:tc>
+      </w:tr>
+      <w:tr>
+        <w:tc>
+          <w:tcPr>
+            <w:tcW w:type="dxa" w:w="2500"/>
+            <w:tcBorders>
+              <w:top w:val="none"/>
+              <w:left w:val="none"/>
+              <w:bottom w:val="none"/>
+              <w:right w:val="none"/>
+            </w:tcBorders>
+            <w:tcMar>
+              <w:top w:type="dxa" w:w="30"/>
+              <w:left w:type="dxa" w:w="0"/>
+              <w:bottom w:type="dxa" w:w="30"/>
+              <w:right w:type="dxa" w:w="120"/>
+            </w:tcMar>
+          </w:tcPr>
+          <w:p>
+            <w:r>
+              <w:rPr>
+                <w:rFonts w:ascii="Arial" w:cs="Arial" w:eastAsia="Arial" w:hAnsi="Arial"/>
+                <w:b/>
+                <w:bCs/>
+                <w:sz w:val="20"/>
+                <w:szCs w:val="20"/>
+              </w:rPr>
+              <w:t xml:space="preserve">Controls &amp; Escalation</w:t>
+            </w:r>
+          </w:p>
+        </w:tc>
+        <w:tc>
+          <w:tcPr>
+            <w:tcW w:type="dxa" w:w="7580"/>
+            <w:tcBorders>
+              <w:top w:val="none"/>
+              <w:left w:val="none"/>
+              <w:bottom w:val="none"/>
+              <w:right w:val="none"/>
+            </w:tcBorders>
+            <w:tcMar>
+              <w:top w:type="dxa" w:w="30"/>
+              <w:left w:type="dxa" w:w="0"/>
+              <w:bottom w:type="dxa" w:w="30"/>
+              <w:right w:type="dxa" w:w="0"/>
+            </w:tcMar>
+          </w:tcPr>
+          <w:p>
+            <w:r>
+              <w:rPr>
+                <w:rFonts w:ascii="Arial" w:cs="Arial" w:eastAsia="Arial" w:hAnsi="Arial"/>
+                <w:sz w:val="20"/>
+                <w:szCs w:val="20"/>
+              </w:rPr>
+              <w:t xml:space="preserve">Time-sensitive escalation management across clients, counterparties, and internal teams in regulated institutional infrastructure; audit-aware workflow discipline.</w:t>
+            </w:r>
+          </w:p>
+        </w:tc>
+      </w:tr>
+      <w:tr>
+        <w:tc>
+          <w:tcPr>
+            <w:tcW w:type="dxa" w:w="2500"/>
+            <w:tcBorders>
+              <w:top w:val="none"/>
+              <w:left w:val="none"/>
+              <w:bottom w:val="none"/>
+              <w:right w:val="none"/>
+            </w:tcBorders>
+            <w:tcMar>
+              <w:top w:type="dxa" w:w="30"/>
+              <w:left w:type="dxa" w:w="0"/>
+              <w:bottom w:type="dxa" w:w="30"/>
+              <w:right w:type="dxa" w:w="120"/>
+            </w:tcMar>
+          </w:tcPr>
+          <w:p>
+            <w:r>
+              <w:rPr>
+                <w:rFonts w:ascii="Arial" w:cs="Arial" w:eastAsia="Arial" w:hAnsi="Arial"/>
+                <w:b/>
+                <w:bCs/>
+                <w:sz w:val="20"/>
+                <w:szCs w:val="20"/>
+              </w:rPr>
+              <w:t xml:space="preserve">Crypto Fluency</w:t>
+            </w:r>
+          </w:p>
+        </w:tc>
+        <w:tc>
+          <w:tcPr>
+            <w:tcW w:type="dxa" w:w="7580"/>
+            <w:tcBorders>
+              <w:top w:val="none"/>
+              <w:left w:val="none"/>
+              <w:bottom w:val="none"/>
+              <w:right w:val="none"/>
+            </w:tcBorders>
+            <w:tcMar>
+              <w:top w:type="dxa" w:w="30"/>
+              <w:left w:type="dxa" w:w="0"/>
+              <w:bottom w:type="dxa" w:w="30"/>
+              <w:right w:type="dxa" w:w="0"/>
+            </w:tcMar>
+          </w:tcPr>
+          <w:p>
+            <w:r>
+              <w:rPr>
+                <w:rFonts w:ascii="Arial" w:cs="Arial" w:eastAsia="Arial" w:hAnsi="Arial"/>
+                <w:sz w:val="20"/>
+                <w:szCs w:val="20"/>
+              </w:rPr>
+              <w:t xml:space="preserve">Hands-on DeFi user (Aave, Curve, Convex, Pendle, Aerodrome); published S&amp;P Global research on oracle risk, crypto/AI, and blockchain interoperability/tokenization.</w:t>
+            </w:r>
+          </w:p>
+        </w:tc>
+      </w:tr>
+      <w:tr>
+        <w:tc>
+          <w:tcPr>
+            <w:tcW w:type="dxa" w:w="2500"/>
+            <w:tcBorders>
+              <w:top w:val="none"/>
+              <w:left w:val="none"/>
+              <w:bottom w:val="none"/>
+              <w:right w:val="none"/>
+            </w:tcBorders>
+            <w:tcMar>
+              <w:top w:type="dxa" w:w="30"/>
+              <w:left w:type="dxa" w:w="0"/>
+              <w:bottom w:type="dxa" w:w="30"/>
+              <w:right w:type="dxa" w:w="120"/>
+            </w:tcMar>
+          </w:tcPr>
+          <w:p>
+            <w:r>
+              <w:rPr>
+                <w:rFonts w:ascii="Arial" w:cs="Arial" w:eastAsia="Arial" w:hAnsi="Arial"/>
+                <w:b/>
+                <w:bCs/>
+                <w:sz w:val="20"/>
+                <w:szCs w:val="20"/>
+              </w:rPr>
+              <w:t xml:space="preserve">Tools</w:t>
+            </w:r>
+          </w:p>
+        </w:tc>
+        <w:tc>
+          <w:tcPr>
+            <w:tcW w:type="dxa" w:w="7580"/>
+            <w:tcBorders>
+              <w:top w:val="none"/>
+              <w:left w:val="none"/>
+              <w:bottom w:val="none"/>
+              <w:right w:val="none"/>
+            </w:tcBorders>
+            <w:tcMar>
+              <w:top w:type="dxa" w:w="30"/>
+              <w:left w:type="dxa" w:w="0"/>
+              <w:bottom w:type="dxa" w:w="30"/>
+              <w:right w:type="dxa" w:w="0"/>
+            </w:tcMar>
+          </w:tcPr>
+          <w:p>
+            <w:r>
+              <w:rPr>
+                <w:rFonts w:ascii="Arial" w:cs="Arial" w:eastAsia="Arial" w:hAnsi="Arial"/>
+                <w:sz w:val="20"/>
+                <w:szCs w:val="20"/>
+              </w:rPr>
+              <w:t xml:space="preserve">ClearPar, WSO, Excel (advanced), process documentation, SQL/Trino exposure, Python/Pandas foundations, JSON/API concepts.</w:t>
+            </w:r>
+          </w:p>
+        </w:tc>
+      </w:tr>
+    </w:tbl>
+    <w:p>
+      <w:pPr>
+        <w:pBdr>
+          <w:bottom w:val="single" w:color="555555" w:sz="4" w:space="2"/>
+        </w:pBdr>
+        <w:spacing w:after="80" w:before="170"/>
+      </w:pPr>
+      <w:r>
+        <w:rPr>
+          <w:rFonts w:ascii="Arial" w:cs="Arial" w:eastAsia="Arial" w:hAnsi="Arial"/>
+          <w:b/>
+          <w:bCs/>
           <w:sz w:val="21"/>
           <w:szCs w:val="21"/>
         </w:rPr>
-        <w:t xml:space="preserve">	Oct 2019 – Present</w:t>
+        <w:t xml:space="preserve">PROFESSIONAL EXPERIENCE</w:t>
+      </w:r>
+    </w:p>
+    <w:p>
+      <w:pPr>
+        <w:tabs>
+          <w:tab w:val="right" w:pos="9026"/>
+        </w:tabs>
+        <w:spacing w:after="30" w:before="90"/>
+      </w:pPr>
+      <w:r>
+        <w:rPr>
+          <w:rFonts w:ascii="Arial" w:cs="Arial" w:eastAsia="Arial" w:hAnsi="Arial"/>
+          <w:b/>
+          <w:bCs/>
+          <w:sz w:val="20"/>
+          <w:szCs w:val="20"/>
+        </w:rPr>
+        <w:t xml:space="preserve">S&amp;P Global | Financial Operations Analyst</w:t>
+      </w:r>
+      <w:r>
+        <w:rPr>
+          <w:rFonts w:ascii="Arial" w:cs="Arial" w:eastAsia="Arial" w:hAnsi="Arial"/>
+          <w:color w:val="555555"/>
+          <w:sz w:val="19"/>
+          <w:szCs w:val="19"/>
+        </w:rPr>
+        <w:t xml:space="preserve">	Dallas, TX / Remote | Oct 2019 - Present</w:t>
       </w:r>
     </w:p>
     <w:p>
@@ -98,15 +380,15 @@
           <w:ilvl w:val="0"/>
           <w:numId w:val="2"/>
         </w:numPr>
-        <w:spacing w:after="40"/>
-      </w:pPr>
-      <w:r>
-        <w:rPr>
-          <w:rFonts w:ascii="Arial" w:cs="Arial" w:eastAsia="Arial" w:hAnsi="Arial"/>
-          <w:sz w:val="21"/>
-          <w:szCs w:val="21"/>
-        </w:rPr>
-        <w:t xml:space="preserve">Facilitated $10B+ in primary and secondary syndicated loan trades; monitored settlement status, documentation, funding requirements, and exceptions across clients, counterparties, custodians, agent banks, and legal stakeholders.</w:t>
+        <w:spacing w:after="30"/>
+      </w:pPr>
+      <w:r>
+        <w:rPr>
+          <w:rFonts w:ascii="Arial" w:cs="Arial" w:eastAsia="Arial" w:hAnsi="Arial"/>
+          <w:sz w:val="20"/>
+          <w:szCs w:val="20"/>
+        </w:rPr>
+        <w:t xml:space="preserve">Facilitated $10B+ in primary and secondary syndicated loan trade workflows through ClearPar and WSO, supporting institutional bank, asset manager, and fund management clients.</w:t>
       </w:r>
     </w:p>
     <w:p>
@@ -116,15 +398,15 @@
           <w:ilvl w:val="0"/>
           <w:numId w:val="2"/>
         </w:numPr>
-        <w:spacing w:after="40"/>
-      </w:pPr>
-      <w:r>
-        <w:rPr>
-          <w:rFonts w:ascii="Arial" w:cs="Arial" w:eastAsia="Arial" w:hAnsi="Arial"/>
-          <w:sz w:val="21"/>
-          <w:szCs w:val="21"/>
-        </w:rPr>
-        <w:t xml:space="preserve">Led analyst coverage for multiple bank and fund-management client portfolios, balancing daily execution, escalation, prioritization, and risk controls.</w:t>
+        <w:spacing w:after="30"/>
+      </w:pPr>
+      <w:r>
+        <w:rPr>
+          <w:rFonts w:ascii="Arial" w:cs="Arial" w:eastAsia="Arial" w:hAnsi="Arial"/>
+          <w:sz w:val="20"/>
+          <w:szCs w:val="20"/>
+        </w:rPr>
+        <w:t xml:space="preserve">Managed daily status tracking across high-volume portfolios, balancing execution speed, accuracy, settlement risk, documentation status, funding requirements, and client communication.</w:t>
       </w:r>
     </w:p>
     <w:p>
@@ -134,15 +416,15 @@
           <w:ilvl w:val="0"/>
           <w:numId w:val="2"/>
         </w:numPr>
-        <w:spacing w:after="40"/>
-      </w:pPr>
-      <w:r>
-        <w:rPr>
-          <w:rFonts w:ascii="Arial" w:cs="Arial" w:eastAsia="Arial" w:hAnsi="Arial"/>
-          <w:sz w:val="21"/>
-          <w:szCs w:val="21"/>
-        </w:rPr>
-        <w:t xml:space="preserve">Converted status signals, documentation gaps, and settlement blockers into clear operational priorities; reduced recurring blockers by streamlining reconciliation and follow-up routines (ClearPar, WSO, Excel).</w:t>
+        <w:spacing w:after="30"/>
+      </w:pPr>
+      <w:r>
+        <w:rPr>
+          <w:rFonts w:ascii="Arial" w:cs="Arial" w:eastAsia="Arial" w:hAnsi="Arial"/>
+          <w:sz w:val="20"/>
+          <w:szCs w:val="20"/>
+        </w:rPr>
+        <w:t xml:space="preserve">Triaged operational exceptions and escalations, coordinating counterparties, custodians, agent banks, and internal teams to resolve blockers under time-sensitive conditions.</w:t>
       </w:r>
     </w:p>
     <w:p>
@@ -152,42 +434,15 @@
           <w:ilvl w:val="0"/>
           <w:numId w:val="2"/>
         </w:numPr>
-        <w:spacing w:after="40"/>
-      </w:pPr>
-      <w:r>
-        <w:rPr>
-          <w:rFonts w:ascii="Arial" w:cs="Arial" w:eastAsia="Arial" w:hAnsi="Arial"/>
-          <w:sz w:val="21"/>
-          <w:szCs w:val="21"/>
-        </w:rPr>
-        <w:t xml:space="preserve">Communicated trade status, blockers, and operational priorities to clients, counterparties, and internal stakeholders — translation work between technical workflows and institutional audiences.</w:t>
-      </w:r>
-    </w:p>
-    <w:p>
-      <w:pPr>
-        <w:tabs>
-          <w:tab w:val="right" w:pos="9026"/>
-        </w:tabs>
-        <w:spacing w:after="40" w:before="110"/>
-      </w:pPr>
-      <w:r>
-        <w:rPr>
-          <w:rFonts w:ascii="Arial" w:cs="Arial" w:eastAsia="Arial" w:hAnsi="Arial"/>
-          <w:b/>
-          <w:bCs/>
-          <w:sz w:val="21"/>
-          <w:szCs w:val="21"/>
-        </w:rPr>
-        <w:t xml:space="preserve">S&amp;P Global — Crypto/Blockchain Research Contributor</w:t>
-      </w:r>
-      <w:r>
-        <w:rPr>
-          <w:rFonts w:ascii="Arial" w:cs="Arial" w:eastAsia="Arial" w:hAnsi="Arial"/>
-          <w:color w:val="555555"/>
-          <w:sz w:val="21"/>
-          <w:szCs w:val="21"/>
-        </w:rPr>
-        <w:t xml:space="preserve">	2023 – 2026</w:t>
+        <w:spacing w:after="30"/>
+      </w:pPr>
+      <w:r>
+        <w:rPr>
+          <w:rFonts w:ascii="Arial" w:cs="Arial" w:eastAsia="Arial" w:hAnsi="Arial"/>
+          <w:sz w:val="20"/>
+          <w:szCs w:val="20"/>
+        </w:rPr>
+        <w:t xml:space="preserve">Led analyst coverage for multiple client portfolios, prioritizing urgent workflows, escalating high-risk exceptions, and maintaining clear operational visibility across complex queues.</w:t>
       </w:r>
     </w:p>
     <w:p>
@@ -197,15 +452,42 @@
           <w:ilvl w:val="0"/>
           <w:numId w:val="2"/>
         </w:numPr>
-        <w:spacing w:after="40"/>
-      </w:pPr>
-      <w:r>
-        <w:rPr>
-          <w:rFonts w:ascii="Arial" w:cs="Arial" w:eastAsia="Arial" w:hAnsi="Arial"/>
-          <w:sz w:val="21"/>
-          <w:szCs w:val="21"/>
-        </w:rPr>
-        <w:t xml:space="preserve">Contributed to published S&amp;P Global research on blockchain oracle risk, crypto/AI convergence, and secure blockchain interoperability supporting tokenization in financial markets.</w:t>
+        <w:spacing w:after="30"/>
+      </w:pPr>
+      <w:r>
+        <w:rPr>
+          <w:rFonts w:ascii="Arial" w:cs="Arial" w:eastAsia="Arial" w:hAnsi="Arial"/>
+          <w:sz w:val="20"/>
+          <w:szCs w:val="20"/>
+        </w:rPr>
+        <w:t xml:space="preserve">Supported reporting visibility and process improvements that reduced ambiguity around aging transactions, status accuracy, and documentation readiness — a reconciliation-and-controls discipline directly applicable to billing operations.</w:t>
+      </w:r>
+    </w:p>
+    <w:p>
+      <w:pPr>
+        <w:tabs>
+          <w:tab w:val="right" w:pos="9026"/>
+        </w:tabs>
+        <w:spacing w:after="30" w:before="90"/>
+      </w:pPr>
+      <w:r>
+        <w:rPr>
+          <w:rFonts w:ascii="Arial" w:cs="Arial" w:eastAsia="Arial" w:hAnsi="Arial"/>
+          <w:b/>
+          <w:bCs/>
+          <w:sz w:val="20"/>
+          <w:szCs w:val="20"/>
+        </w:rPr>
+        <w:t xml:space="preserve">Ames Energy Partners | Data Analyst &amp; Mineral Rights Buyer</w:t>
+      </w:r>
+      <w:r>
+        <w:rPr>
+          <w:rFonts w:ascii="Arial" w:cs="Arial" w:eastAsia="Arial" w:hAnsi="Arial"/>
+          <w:color w:val="555555"/>
+          <w:sz w:val="19"/>
+          <w:szCs w:val="19"/>
+        </w:rPr>
+        <w:t xml:space="preserve">	Oklahoma City, OK | May 2018 - Aug 2018</w:t>
       </w:r>
     </w:p>
     <w:p>
@@ -215,23 +497,23 @@
           <w:ilvl w:val="0"/>
           <w:numId w:val="2"/>
         </w:numPr>
-        <w:spacing w:after="40"/>
-      </w:pPr>
-      <w:r>
-        <w:rPr>
-          <w:rFonts w:ascii="Arial" w:cs="Arial" w:eastAsia="Arial" w:hAnsi="Arial"/>
-          <w:sz w:val="21"/>
-          <w:szCs w:val="21"/>
-        </w:rPr>
-        <w:t xml:space="preserve">Applied an institutional risk lens to onchain infrastructure: data quality, concentration risk, cross-chain communication, and workflow integrity.</w:t>
-      </w:r>
-    </w:p>
-    <w:p>
-      <w:pPr>
-        <w:tabs>
-          <w:tab w:val="right" w:pos="9026"/>
-        </w:tabs>
-        <w:spacing w:after="40" w:before="110"/>
+        <w:spacing w:after="30"/>
+      </w:pPr>
+      <w:r>
+        <w:rPr>
+          <w:rFonts w:ascii="Arial" w:cs="Arial" w:eastAsia="Arial" w:hAnsi="Arial"/>
+          <w:sz w:val="20"/>
+          <w:szCs w:val="20"/>
+        </w:rPr>
+        <w:t xml:space="preserve">Compiled, organized, and analyzed land and mineral-rights data across multiple platforms to support acquisition targeting, transaction evaluation, and deal review.</w:t>
+      </w:r>
+    </w:p>
+    <w:p>
+      <w:pPr>
+        <w:pBdr>
+          <w:bottom w:val="single" w:color="555555" w:sz="4" w:space="2"/>
+        </w:pBdr>
+        <w:spacing w:after="80" w:before="170"/>
       </w:pPr>
       <w:r>
         <w:rPr>
@@ -241,16 +523,7 @@
           <w:sz w:val="21"/>
           <w:szCs w:val="21"/>
         </w:rPr>
-        <w:t xml:space="preserve">Ames Energy Partners — Data Analyst &amp; Mineral Rights Buyer</w:t>
-      </w:r>
-      <w:r>
-        <w:rPr>
-          <w:rFonts w:ascii="Arial" w:cs="Arial" w:eastAsia="Arial" w:hAnsi="Arial"/>
-          <w:color w:val="555555"/>
-          <w:sz w:val="21"/>
-          <w:szCs w:val="21"/>
-        </w:rPr>
-        <w:t xml:space="preserve">	2018</w:t>
+        <w:t xml:space="preserve">CRYPTO RESEARCH &amp; DEFI EXPERIENCE</w:t>
       </w:r>
     </w:p>
     <w:p>
@@ -260,42 +533,15 @@
           <w:ilvl w:val="0"/>
           <w:numId w:val="2"/>
         </w:numPr>
-        <w:spacing w:after="40"/>
-      </w:pPr>
-      <w:r>
-        <w:rPr>
-          <w:rFonts w:ascii="Arial" w:cs="Arial" w:eastAsia="Arial" w:hAnsi="Arial"/>
-          <w:sz w:val="21"/>
-          <w:szCs w:val="21"/>
-        </w:rPr>
-        <w:t xml:space="preserve">Aggregated and analyzed land and mineral-rights data to support acquisition targeting; contacted and negotiated directly with landowners; maintained deal and research records.</w:t>
-      </w:r>
-    </w:p>
-    <w:p>
-      <w:pPr>
-        <w:tabs>
-          <w:tab w:val="right" w:pos="9026"/>
-        </w:tabs>
-        <w:spacing w:after="40" w:before="110"/>
-      </w:pPr>
-      <w:r>
-        <w:rPr>
-          <w:rFonts w:ascii="Arial" w:cs="Arial" w:eastAsia="Arial" w:hAnsi="Arial"/>
-          <w:b/>
-          <w:bCs/>
-          <w:sz w:val="21"/>
-          <w:szCs w:val="21"/>
-        </w:rPr>
-        <w:t xml:space="preserve">Independent — DeFi / Market-Infrastructure Researcher</w:t>
-      </w:r>
-      <w:r>
-        <w:rPr>
-          <w:rFonts w:ascii="Arial" w:cs="Arial" w:eastAsia="Arial" w:hAnsi="Arial"/>
-          <w:color w:val="555555"/>
-          <w:sz w:val="21"/>
-          <w:szCs w:val="21"/>
-        </w:rPr>
-        <w:t xml:space="preserve">	Ongoing</w:t>
+        <w:spacing w:after="30"/>
+      </w:pPr>
+      <w:r>
+        <w:rPr>
+          <w:rFonts w:ascii="Arial" w:cs="Arial" w:eastAsia="Arial" w:hAnsi="Arial"/>
+          <w:sz w:val="20"/>
+          <w:szCs w:val="20"/>
+        </w:rPr>
+        <w:t xml:space="preserve">Published S&amp;P Global crypto research contributor: "Utility at a Cost: Assessing the Risks of Blockchain Oracles," "Crypto and AI: Shaping the Future of the Internet," and "Secure Blockchain Interoperability Supports Growth of Tokenization in Financial Markets."</w:t>
       </w:r>
     </w:p>
     <w:p>
@@ -305,33 +551,15 @@
           <w:ilvl w:val="0"/>
           <w:numId w:val="2"/>
         </w:numPr>
-        <w:spacing w:after="40"/>
-      </w:pPr>
-      <w:r>
-        <w:rPr>
-          <w:rFonts w:ascii="Arial" w:cs="Arial" w:eastAsia="Arial" w:hAnsi="Arial"/>
-          <w:sz w:val="21"/>
-          <w:szCs w:val="21"/>
-        </w:rPr>
-        <w:t xml:space="preserve">Hands-on user of major DeFi protocols (Aave, Curve, Convex, Pendle, Aerodrome) with a risk-first lens on liquidity, collateral mechanics, governance, and operational controls; built an AI-assisted operations system on Git-based workflows with working Python/Pandas and SQL foundations.</w:t>
-      </w:r>
-    </w:p>
-    <w:p>
-      <w:pPr>
-        <w:pBdr>
-          <w:bottom w:val="single" w:color="444444" w:sz="4" w:space="2"/>
-        </w:pBdr>
-        <w:spacing w:after="90" w:before="200"/>
-      </w:pPr>
-      <w:r>
-        <w:rPr>
-          <w:rFonts w:ascii="Arial" w:cs="Arial" w:eastAsia="Arial" w:hAnsi="Arial"/>
-          <w:b/>
-          <w:bCs/>
-          <w:sz w:val="22"/>
-          <w:szCs w:val="22"/>
-        </w:rPr>
-        <w:t xml:space="preserve">PUBLICATIONS (S&amp;P GLOBAL — CONTRIBUTOR)</w:t>
+        <w:spacing w:after="30"/>
+      </w:pPr>
+      <w:r>
+        <w:rPr>
+          <w:rFonts w:ascii="Arial" w:cs="Arial" w:eastAsia="Arial" w:hAnsi="Arial"/>
+          <w:sz w:val="20"/>
+          <w:szCs w:val="20"/>
+        </w:rPr>
+        <w:t xml:space="preserve">Hands-on DeFi user across Aave, Curve, Convex, Pendle, and Aerodrome with a risk-first lens on liquidity, collateral mechanics, incentives, governance, and operational controls.</w:t>
       </w:r>
     </w:p>
     <w:p>
@@ -341,99 +569,63 @@
           <w:ilvl w:val="0"/>
           <w:numId w:val="2"/>
         </w:numPr>
-        <w:spacing w:after="40"/>
-      </w:pPr>
-      <w:r>
-        <w:rPr>
-          <w:rFonts w:ascii="Arial" w:cs="Arial" w:eastAsia="Arial" w:hAnsi="Arial"/>
+        <w:spacing w:after="30"/>
+      </w:pPr>
+      <w:r>
+        <w:rPr>
+          <w:rFonts w:ascii="Arial" w:cs="Arial" w:eastAsia="Arial" w:hAnsi="Arial"/>
+          <w:sz w:val="20"/>
+          <w:szCs w:val="20"/>
+        </w:rPr>
+        <w:t xml:space="preserve">Built an AI-assisted operations command center on Git-based workflows (scheduled agents, Python-scripted reporting) — working Python/Pandas and SQL foundations sharpened daily.</w:t>
+      </w:r>
+    </w:p>
+    <w:p>
+      <w:pPr>
+        <w:pBdr>
+          <w:bottom w:val="single" w:color="555555" w:sz="4" w:space="2"/>
+        </w:pBdr>
+        <w:spacing w:after="80" w:before="170"/>
+      </w:pPr>
+      <w:r>
+        <w:rPr>
+          <w:rFonts w:ascii="Arial" w:cs="Arial" w:eastAsia="Arial" w:hAnsi="Arial"/>
+          <w:b/>
+          <w:bCs/>
           <w:sz w:val="21"/>
           <w:szCs w:val="21"/>
         </w:rPr>
-        <w:t xml:space="preserve">Utility at a Cost: Assessing the Risks of Blockchain Oracles</w:t>
-      </w:r>
-    </w:p>
-    <w:p>
-      <w:pPr>
-        <w:pStyle w:val="ListParagraph"/>
-        <w:numPr>
-          <w:ilvl w:val="0"/>
-          <w:numId w:val="2"/>
-        </w:numPr>
-        <w:spacing w:after="40"/>
-      </w:pPr>
-      <w:r>
-        <w:rPr>
-          <w:rFonts w:ascii="Arial" w:cs="Arial" w:eastAsia="Arial" w:hAnsi="Arial"/>
+        <w:t xml:space="preserve">TOOLS &amp; KNOWLEDGE AREAS</w:t>
+      </w:r>
+    </w:p>
+    <w:p>
+      <w:pPr>
+        <w:spacing w:after="90"/>
+      </w:pPr>
+      <w:r>
+        <w:rPr>
+          <w:rFonts w:ascii="Arial" w:cs="Arial" w:eastAsia="Arial" w:hAnsi="Arial"/>
+          <w:sz w:val="20"/>
+          <w:szCs w:val="20"/>
+        </w:rPr>
+        <w:t xml:space="preserve">ClearPar | WSO | Excel | reconciliation &amp; exception management | escalation &amp; stakeholder coordination | operational controls | process documentation | Dune/SQL concepts | Python/Pandas foundations | JSON/API concepts | block explorers | stablecoins &amp; crypto payments concepts</w:t>
+      </w:r>
+    </w:p>
+    <w:p>
+      <w:pPr>
+        <w:pBdr>
+          <w:bottom w:val="single" w:color="555555" w:sz="4" w:space="2"/>
+        </w:pBdr>
+        <w:spacing w:after="80" w:before="170"/>
+      </w:pPr>
+      <w:r>
+        <w:rPr>
+          <w:rFonts w:ascii="Arial" w:cs="Arial" w:eastAsia="Arial" w:hAnsi="Arial"/>
+          <w:b/>
+          <w:bCs/>
           <w:sz w:val="21"/>
           <w:szCs w:val="21"/>
         </w:rPr>
-        <w:t xml:space="preserve">Crypto and AI: Shaping the Future of the Internet (S&amp;P Look Forward Council Award)</w:t>
-      </w:r>
-    </w:p>
-    <w:p>
-      <w:pPr>
-        <w:pStyle w:val="ListParagraph"/>
-        <w:numPr>
-          <w:ilvl w:val="0"/>
-          <w:numId w:val="2"/>
-        </w:numPr>
-        <w:spacing w:after="40"/>
-      </w:pPr>
-      <w:r>
-        <w:rPr>
-          <w:rFonts w:ascii="Arial" w:cs="Arial" w:eastAsia="Arial" w:hAnsi="Arial"/>
-          <w:sz w:val="21"/>
-          <w:szCs w:val="21"/>
-        </w:rPr>
-        <w:t xml:space="preserve">Secure Blockchain Interoperability Supports Growth of Tokenization in Financial Markets</w:t>
-      </w:r>
-    </w:p>
-    <w:p>
-      <w:pPr>
-        <w:pBdr>
-          <w:bottom w:val="single" w:color="444444" w:sz="4" w:space="2"/>
-        </w:pBdr>
-        <w:spacing w:after="90" w:before="200"/>
-      </w:pPr>
-      <w:r>
-        <w:rPr>
-          <w:rFonts w:ascii="Arial" w:cs="Arial" w:eastAsia="Arial" w:hAnsi="Arial"/>
-          <w:b/>
-          <w:bCs/>
-          <w:sz w:val="22"/>
-          <w:szCs w:val="22"/>
-        </w:rPr>
-        <w:t xml:space="preserve">SKILLS</w:t>
-      </w:r>
-    </w:p>
-    <w:p>
-      <w:pPr>
-        <w:spacing w:after="100"/>
-      </w:pPr>
-      <w:r>
-        <w:rPr>
-          <w:rFonts w:ascii="Arial" w:cs="Arial" w:eastAsia="Arial" w:hAnsi="Arial"/>
-          <w:sz w:val="21"/>
-          <w:szCs w:val="21"/>
-        </w:rPr>
-        <w:t xml:space="preserve">Reconciliation &amp; exception management · escalation &amp; stakeholder coordination · operational controls · ClearPar · WSO · Excel (advanced) · Python/Pandas and SQL (working foundations) · JSON/REST APIs · DeFi protocols &amp; wallet operations</w:t>
-      </w:r>
-    </w:p>
-    <w:p>
-      <w:pPr>
-        <w:pBdr>
-          <w:bottom w:val="single" w:color="444444" w:sz="4" w:space="2"/>
-        </w:pBdr>
-        <w:spacing w:after="90" w:before="200"/>
-      </w:pPr>
-      <w:r>
-        <w:rPr>
-          <w:rFonts w:ascii="Arial" w:cs="Arial" w:eastAsia="Arial" w:hAnsi="Arial"/>
-          <w:b/>
-          <w:bCs/>
-          <w:sz w:val="22"/>
-          <w:szCs w:val="22"/>
-        </w:rPr>
         <w:t xml:space="preserve">EDUCATION</w:t>
       </w:r>
     </w:p>
@@ -441,15 +633,15 @@
       <w:r>
         <w:rPr>
           <w:rFonts w:ascii="Arial" w:cs="Arial" w:eastAsia="Arial" w:hAnsi="Arial"/>
-          <w:sz w:val="21"/>
-          <w:szCs w:val="21"/>
-        </w:rPr>
-        <w:t xml:space="preserve">[Josh: degree, school, year — fill before submitting]</w:t>
+          <w:sz w:val="20"/>
+          <w:szCs w:val="20"/>
+        </w:rPr>
+        <w:t xml:space="preserve">University of Oklahoma - B.B.A., Entrepreneurship &amp; Venture Management; Minor in Finance | May 2019</w:t>
       </w:r>
     </w:p>
     <w:sectPr>
       <w:pgSz w:w="12240" w:h="15840" w:orient="portrait"/>
-      <w:pgMar w:top="900" w:right="1080" w:bottom="900" w:left="1080" w:header="708" w:footer="708" w:gutter="0"/>
+      <w:pgMar w:top="800" w:right="1080" w:bottom="800" w:left="1080" w:header="708" w:footer="708" w:gutter="0"/>
       <w:pgNumType/>
       <w:docGrid w:linePitch="360"/>
     </w:sectPr>
@@ -629,7 +821,7 @@
       <w:lvlText w:val="•"/>
       <w:lvlJc w:val="left"/>
       <w:pPr>
-        <w:ind w:left="340" w:hanging="200"/>
+        <w:ind w:left="300" w:hanging="180"/>
       </w:pPr>
     </w:lvl>
   </w:abstractNum>
@@ -654,8 +846,8 @@
     <w:rPrDefault>
       <w:rPr>
         <w:rFonts w:ascii="Arial" w:cs="Arial" w:eastAsia="Arial" w:hAnsi="Arial"/>
-        <w:sz w:val="21"/>
-        <w:szCs w:val="21"/>
+        <w:sz w:val="20"/>
+        <w:szCs w:val="20"/>
       </w:rPr>
     </w:rPrDefault>
     <w:pPrDefault/>

</xml_diff>

<commit_message>
resume v3: table killed (viewer-proof bold-label lines) + polished PDF as primary submit file
</commit_message>
<xml_diff>
--- a/jobs/packets/active/coinbase-billing-ops/resume-coinbase.docx
+++ b/jobs/packets/active/coinbase-billing-ops/resume-coinbase.docx
@@ -79,255 +79,98 @@
         <w:t xml:space="preserve">COINBASE ROLE ALIGNMENT</w:t>
       </w:r>
     </w:p>
-    <w:tbl>
-      <w:tblPr>
-        <w:tblW w:type="dxa" w:w="10080"/>
-        <w:tblBorders>
-          <w:top w:val="single" w:color="auto" w:sz="4"/>
-          <w:left w:val="single" w:color="auto" w:sz="4"/>
-          <w:bottom w:val="single" w:color="auto" w:sz="4"/>
-          <w:right w:val="single" w:color="auto" w:sz="4"/>
-          <w:insideH w:val="single" w:color="auto" w:sz="4"/>
-          <w:insideV w:val="single" w:color="auto" w:sz="4"/>
-        </w:tblBorders>
-      </w:tblPr>
-      <w:tblGrid>
-        <w:gridCol w:w="2500"/>
-        <w:gridCol w:w="7580"/>
-      </w:tblGrid>
-      <w:tr>
-        <w:tc>
-          <w:tcPr>
-            <w:tcW w:type="dxa" w:w="2500"/>
-            <w:tcBorders>
-              <w:top w:val="none"/>
-              <w:left w:val="none"/>
-              <w:bottom w:val="none"/>
-              <w:right w:val="none"/>
-            </w:tcBorders>
-            <w:tcMar>
-              <w:top w:type="dxa" w:w="30"/>
-              <w:left w:type="dxa" w:w="0"/>
-              <w:bottom w:type="dxa" w:w="30"/>
-              <w:right w:type="dxa" w:w="120"/>
-            </w:tcMar>
-          </w:tcPr>
-          <w:p>
-            <w:r>
-              <w:rPr>
-                <w:rFonts w:ascii="Arial" w:cs="Arial" w:eastAsia="Arial" w:hAnsi="Arial"/>
-                <w:b/>
-                <w:bCs/>
-                <w:sz w:val="20"/>
-                <w:szCs w:val="20"/>
-              </w:rPr>
-              <w:t xml:space="preserve">Billing &amp; Reconciliation Ops</w:t>
-            </w:r>
-          </w:p>
-        </w:tc>
-        <w:tc>
-          <w:tcPr>
-            <w:tcW w:type="dxa" w:w="7580"/>
-            <w:tcBorders>
-              <w:top w:val="none"/>
-              <w:left w:val="none"/>
-              <w:bottom w:val="none"/>
-              <w:right w:val="none"/>
-            </w:tcBorders>
-            <w:tcMar>
-              <w:top w:type="dxa" w:w="30"/>
-              <w:left w:type="dxa" w:w="0"/>
-              <w:bottom w:type="dxa" w:w="30"/>
-              <w:right w:type="dxa" w:w="0"/>
-            </w:tcMar>
-          </w:tcPr>
-          <w:p>
-            <w:r>
-              <w:rPr>
-                <w:rFonts w:ascii="Arial" w:cs="Arial" w:eastAsia="Arial" w:hAnsi="Arial"/>
-                <w:sz w:val="20"/>
-                <w:szCs w:val="20"/>
-              </w:rPr>
-              <w:t xml:space="preserve">High-volume transaction monitoring, exception triage, reconciliation mindset, documentation and funding accuracy, aging-item resolution, operational controls.</w:t>
-            </w:r>
-          </w:p>
-        </w:tc>
-      </w:tr>
-      <w:tr>
-        <w:tc>
-          <w:tcPr>
-            <w:tcW w:type="dxa" w:w="2500"/>
-            <w:tcBorders>
-              <w:top w:val="none"/>
-              <w:left w:val="none"/>
-              <w:bottom w:val="none"/>
-              <w:right w:val="none"/>
-            </w:tcBorders>
-            <w:tcMar>
-              <w:top w:type="dxa" w:w="30"/>
-              <w:left w:type="dxa" w:w="0"/>
-              <w:bottom w:type="dxa" w:w="30"/>
-              <w:right w:type="dxa" w:w="120"/>
-            </w:tcMar>
-          </w:tcPr>
-          <w:p>
-            <w:r>
-              <w:rPr>
-                <w:rFonts w:ascii="Arial" w:cs="Arial" w:eastAsia="Arial" w:hAnsi="Arial"/>
-                <w:b/>
-                <w:bCs/>
-                <w:sz w:val="20"/>
-                <w:szCs w:val="20"/>
-              </w:rPr>
-              <w:t xml:space="preserve">Controls &amp; Escalation</w:t>
-            </w:r>
-          </w:p>
-        </w:tc>
-        <w:tc>
-          <w:tcPr>
-            <w:tcW w:type="dxa" w:w="7580"/>
-            <w:tcBorders>
-              <w:top w:val="none"/>
-              <w:left w:val="none"/>
-              <w:bottom w:val="none"/>
-              <w:right w:val="none"/>
-            </w:tcBorders>
-            <w:tcMar>
-              <w:top w:type="dxa" w:w="30"/>
-              <w:left w:type="dxa" w:w="0"/>
-              <w:bottom w:type="dxa" w:w="30"/>
-              <w:right w:type="dxa" w:w="0"/>
-            </w:tcMar>
-          </w:tcPr>
-          <w:p>
-            <w:r>
-              <w:rPr>
-                <w:rFonts w:ascii="Arial" w:cs="Arial" w:eastAsia="Arial" w:hAnsi="Arial"/>
-                <w:sz w:val="20"/>
-                <w:szCs w:val="20"/>
-              </w:rPr>
-              <w:t xml:space="preserve">Time-sensitive escalation management across clients, counterparties, and internal teams in regulated institutional infrastructure; audit-aware workflow discipline.</w:t>
-            </w:r>
-          </w:p>
-        </w:tc>
-      </w:tr>
-      <w:tr>
-        <w:tc>
-          <w:tcPr>
-            <w:tcW w:type="dxa" w:w="2500"/>
-            <w:tcBorders>
-              <w:top w:val="none"/>
-              <w:left w:val="none"/>
-              <w:bottom w:val="none"/>
-              <w:right w:val="none"/>
-            </w:tcBorders>
-            <w:tcMar>
-              <w:top w:type="dxa" w:w="30"/>
-              <w:left w:type="dxa" w:w="0"/>
-              <w:bottom w:type="dxa" w:w="30"/>
-              <w:right w:type="dxa" w:w="120"/>
-            </w:tcMar>
-          </w:tcPr>
-          <w:p>
-            <w:r>
-              <w:rPr>
-                <w:rFonts w:ascii="Arial" w:cs="Arial" w:eastAsia="Arial" w:hAnsi="Arial"/>
-                <w:b/>
-                <w:bCs/>
-                <w:sz w:val="20"/>
-                <w:szCs w:val="20"/>
-              </w:rPr>
-              <w:t xml:space="preserve">Crypto Fluency</w:t>
-            </w:r>
-          </w:p>
-        </w:tc>
-        <w:tc>
-          <w:tcPr>
-            <w:tcW w:type="dxa" w:w="7580"/>
-            <w:tcBorders>
-              <w:top w:val="none"/>
-              <w:left w:val="none"/>
-              <w:bottom w:val="none"/>
-              <w:right w:val="none"/>
-            </w:tcBorders>
-            <w:tcMar>
-              <w:top w:type="dxa" w:w="30"/>
-              <w:left w:type="dxa" w:w="0"/>
-              <w:bottom w:type="dxa" w:w="30"/>
-              <w:right w:type="dxa" w:w="0"/>
-            </w:tcMar>
-          </w:tcPr>
-          <w:p>
-            <w:r>
-              <w:rPr>
-                <w:rFonts w:ascii="Arial" w:cs="Arial" w:eastAsia="Arial" w:hAnsi="Arial"/>
-                <w:sz w:val="20"/>
-                <w:szCs w:val="20"/>
-              </w:rPr>
-              <w:t xml:space="preserve">Hands-on DeFi user (Aave, Curve, Convex, Pendle, Aerodrome); published S&amp;P Global research on oracle risk, crypto/AI, and blockchain interoperability/tokenization.</w:t>
-            </w:r>
-          </w:p>
-        </w:tc>
-      </w:tr>
-      <w:tr>
-        <w:tc>
-          <w:tcPr>
-            <w:tcW w:type="dxa" w:w="2500"/>
-            <w:tcBorders>
-              <w:top w:val="none"/>
-              <w:left w:val="none"/>
-              <w:bottom w:val="none"/>
-              <w:right w:val="none"/>
-            </w:tcBorders>
-            <w:tcMar>
-              <w:top w:type="dxa" w:w="30"/>
-              <w:left w:type="dxa" w:w="0"/>
-              <w:bottom w:type="dxa" w:w="30"/>
-              <w:right w:type="dxa" w:w="120"/>
-            </w:tcMar>
-          </w:tcPr>
-          <w:p>
-            <w:r>
-              <w:rPr>
-                <w:rFonts w:ascii="Arial" w:cs="Arial" w:eastAsia="Arial" w:hAnsi="Arial"/>
-                <w:b/>
-                <w:bCs/>
-                <w:sz w:val="20"/>
-                <w:szCs w:val="20"/>
-              </w:rPr>
-              <w:t xml:space="preserve">Tools</w:t>
-            </w:r>
-          </w:p>
-        </w:tc>
-        <w:tc>
-          <w:tcPr>
-            <w:tcW w:type="dxa" w:w="7580"/>
-            <w:tcBorders>
-              <w:top w:val="none"/>
-              <w:left w:val="none"/>
-              <w:bottom w:val="none"/>
-              <w:right w:val="none"/>
-            </w:tcBorders>
-            <w:tcMar>
-              <w:top w:type="dxa" w:w="30"/>
-              <w:left w:type="dxa" w:w="0"/>
-              <w:bottom w:type="dxa" w:w="30"/>
-              <w:right w:type="dxa" w:w="0"/>
-            </w:tcMar>
-          </w:tcPr>
-          <w:p>
-            <w:r>
-              <w:rPr>
-                <w:rFonts w:ascii="Arial" w:cs="Arial" w:eastAsia="Arial" w:hAnsi="Arial"/>
-                <w:sz w:val="20"/>
-                <w:szCs w:val="20"/>
-              </w:rPr>
-              <w:t xml:space="preserve">ClearPar, WSO, Excel (advanced), process documentation, SQL/Trino exposure, Python/Pandas foundations, JSON/API concepts.</w:t>
-            </w:r>
-          </w:p>
-        </w:tc>
-      </w:tr>
-    </w:tbl>
+    <w:p>
+      <w:pPr>
+        <w:spacing w:after="50"/>
+      </w:pPr>
+      <w:r>
+        <w:rPr>
+          <w:rFonts w:ascii="Arial" w:cs="Arial" w:eastAsia="Arial" w:hAnsi="Arial"/>
+          <w:b/>
+          <w:bCs/>
+          <w:sz w:val="20"/>
+          <w:szCs w:val="20"/>
+        </w:rPr>
+        <w:t xml:space="preserve">Billing &amp; Reconciliation Ops — </w:t>
+      </w:r>
+      <w:r>
+        <w:rPr>
+          <w:rFonts w:ascii="Arial" w:cs="Arial" w:eastAsia="Arial" w:hAnsi="Arial"/>
+          <w:sz w:val="20"/>
+          <w:szCs w:val="20"/>
+        </w:rPr>
+        <w:t xml:space="preserve">high-volume transaction monitoring, exception triage, reconciliation mindset, documentation and funding accuracy, aging-item resolution, operational controls.</w:t>
+      </w:r>
+    </w:p>
+    <w:p>
+      <w:pPr>
+        <w:spacing w:after="50"/>
+      </w:pPr>
+      <w:r>
+        <w:rPr>
+          <w:rFonts w:ascii="Arial" w:cs="Arial" w:eastAsia="Arial" w:hAnsi="Arial"/>
+          <w:b/>
+          <w:bCs/>
+          <w:sz w:val="20"/>
+          <w:szCs w:val="20"/>
+        </w:rPr>
+        <w:t xml:space="preserve">Controls &amp; Escalation — </w:t>
+      </w:r>
+      <w:r>
+        <w:rPr>
+          <w:rFonts w:ascii="Arial" w:cs="Arial" w:eastAsia="Arial" w:hAnsi="Arial"/>
+          <w:sz w:val="20"/>
+          <w:szCs w:val="20"/>
+        </w:rPr>
+        <w:t xml:space="preserve">time-sensitive escalation management across clients, counterparties, and internal teams in regulated institutional infrastructure; audit-aware workflow discipline.</w:t>
+      </w:r>
+    </w:p>
+    <w:p>
+      <w:pPr>
+        <w:spacing w:after="50"/>
+      </w:pPr>
+      <w:r>
+        <w:rPr>
+          <w:rFonts w:ascii="Arial" w:cs="Arial" w:eastAsia="Arial" w:hAnsi="Arial"/>
+          <w:b/>
+          <w:bCs/>
+          <w:sz w:val="20"/>
+          <w:szCs w:val="20"/>
+        </w:rPr>
+        <w:t xml:space="preserve">Crypto Fluency — </w:t>
+      </w:r>
+      <w:r>
+        <w:rPr>
+          <w:rFonts w:ascii="Arial" w:cs="Arial" w:eastAsia="Arial" w:hAnsi="Arial"/>
+          <w:sz w:val="20"/>
+          <w:szCs w:val="20"/>
+        </w:rPr>
+        <w:t xml:space="preserve">hands-on DeFi user (Aave, Curve, Convex, Pendle, Aerodrome); published S&amp;P Global research on oracle risk, crypto/AI, and blockchain interoperability/tokenization.</w:t>
+      </w:r>
+    </w:p>
+    <w:p>
+      <w:pPr>
+        <w:spacing w:after="50"/>
+      </w:pPr>
+      <w:r>
+        <w:rPr>
+          <w:rFonts w:ascii="Arial" w:cs="Arial" w:eastAsia="Arial" w:hAnsi="Arial"/>
+          <w:b/>
+          <w:bCs/>
+          <w:sz w:val="20"/>
+          <w:szCs w:val="20"/>
+        </w:rPr>
+        <w:t xml:space="preserve">Tools — </w:t>
+      </w:r>
+      <w:r>
+        <w:rPr>
+          <w:rFonts w:ascii="Arial" w:cs="Arial" w:eastAsia="Arial" w:hAnsi="Arial"/>
+          <w:sz w:val="20"/>
+          <w:szCs w:val="20"/>
+        </w:rPr>
+        <w:t xml:space="preserve">ClearPar, WSO, Excel (advanced), process documentation, SQL/Trino exposure, Python/Pandas foundations, JSON/API concepts.</w:t>
+      </w:r>
+    </w:p>
     <w:p>
       <w:pPr>
         <w:pBdr>

</xml_diff>